<commit_message>
deleted my old repo
</commit_message>
<xml_diff>
--- a/results/Implementation and Verification of the ACDI Method.docx
+++ b/results/Implementation and Verification of the ACDI Method.docx
@@ -3058,28 +3058,37 @@
       <w:pPr>
         <w:rPr>
           <w:rFonts w:ascii="Times New Roman" w:hAnsi="Times New Roman" w:cs="Times New Roman"/>
-        </w:rPr>
-      </w:pPr>
-    </w:p>
-    <w:p>
-      <w:pPr>
-        <w:rPr>
-          <w:rFonts w:ascii="Times New Roman" w:hAnsi="Times New Roman" w:cs="Times New Roman"/>
-        </w:rPr>
-      </w:pPr>
-      <w:r>
-        <w:rPr>
-          <w:rFonts w:ascii="Times New Roman" w:hAnsi="Times New Roman" w:cs="Times New Roman"/>
+          <w:i/>
+          <w:iCs/>
+        </w:rPr>
+      </w:pPr>
+    </w:p>
+    <w:p>
+      <w:pPr>
+        <w:rPr>
+          <w:rFonts w:ascii="Times New Roman" w:hAnsi="Times New Roman" w:cs="Times New Roman"/>
+        </w:rPr>
+      </w:pPr>
+      <w:r>
+        <w:rPr>
+          <w:rFonts w:ascii="Times New Roman" w:hAnsi="Times New Roman" w:cs="Times New Roman"/>
+          <w:i/>
+          <w:iCs/>
         </w:rPr>
         <w:t>3.7 Simulation Parameters</w:t>
       </w:r>
-    </w:p>
-    <w:p>
-      <w:pPr>
-        <w:rPr>
-          <w:rFonts w:ascii="Times New Roman" w:hAnsi="Times New Roman" w:cs="Times New Roman"/>
-        </w:rPr>
-      </w:pPr>
+      <w:r>
+        <w:rPr>
+          <w:rFonts w:ascii="Times New Roman" w:hAnsi="Times New Roman" w:cs="Times New Roman"/>
+        </w:rPr>
+        <w:br/>
+      </w:r>
+      <w:r>
+        <w:rPr>
+          <w:rFonts w:ascii="Times New Roman" w:hAnsi="Times New Roman" w:cs="Times New Roman"/>
+        </w:rPr>
+        <w:tab/>
+      </w:r>
       <w:r>
         <w:rPr>
           <w:rFonts w:ascii="Times New Roman" w:hAnsi="Times New Roman" w:cs="Times New Roman"/>
@@ -4784,18 +4793,23 @@
       <w:r>
         <w:rPr>
           <w:rFonts w:ascii="Times New Roman" w:hAnsi="Times New Roman" w:cs="Times New Roman"/>
-          <w:b/>
-          <w:bCs/>
+          <w:i/>
+          <w:iCs/>
         </w:rPr>
         <w:t>4.3 Results</w:t>
       </w:r>
-    </w:p>
-    <w:p>
-      <w:pPr>
-        <w:rPr>
-          <w:rFonts w:ascii="Times New Roman" w:hAnsi="Times New Roman" w:cs="Times New Roman"/>
-        </w:rPr>
-      </w:pPr>
+      <w:r>
+        <w:rPr>
+          <w:rFonts w:ascii="Times New Roman" w:hAnsi="Times New Roman" w:cs="Times New Roman"/>
+        </w:rPr>
+        <w:br/>
+      </w:r>
+      <w:r>
+        <w:rPr>
+          <w:rFonts w:ascii="Times New Roman" w:hAnsi="Times New Roman" w:cs="Times New Roman"/>
+        </w:rPr>
+        <w:tab/>
+      </w:r>
       <w:r>
         <w:rPr>
           <w:rFonts w:ascii="Times New Roman" w:hAnsi="Times New Roman" w:cs="Times New Roman"/>
@@ -5509,11 +5523,57 @@
       <w:r>
         <w:rPr>
           <w:rFonts w:ascii="Times New Roman" w:hAnsi="Times New Roman" w:cs="Times New Roman"/>
-          <w:b/>
-          <w:bCs/>
+          <w:i/>
+          <w:iCs/>
         </w:rPr>
         <w:t>4.4 Discussion</w:t>
       </w:r>
+      <w:r>
+        <w:rPr>
+          <w:rFonts w:ascii="Times New Roman" w:hAnsi="Times New Roman" w:cs="Times New Roman"/>
+        </w:rPr>
+        <w:br/>
+      </w:r>
+      <w:r>
+        <w:rPr>
+          <w:rFonts w:ascii="Times New Roman" w:hAnsi="Times New Roman" w:cs="Times New Roman"/>
+        </w:rPr>
+        <w:tab/>
+      </w:r>
+      <w:r>
+        <w:rPr>
+          <w:rFonts w:ascii="Times New Roman" w:hAnsi="Times New Roman" w:cs="Times New Roman"/>
+        </w:rPr>
+        <w:t xml:space="preserve">The results confirm the expected progression from Task 1 through Task 4. Task 1 produces the largest error — the upwind scheme introduces numerical diffusion proportional to </w:t>
+      </w:r>
+      <w:proofErr w:type="spellStart"/>
+      <w:r>
+        <w:rPr>
+          <w:rFonts w:ascii="Times New Roman" w:hAnsi="Times New Roman" w:cs="Times New Roman"/>
+        </w:rPr>
+        <w:t>u·Δx</w:t>
+      </w:r>
+      <w:proofErr w:type="spellEnd"/>
+      <w:r>
+        <w:rPr>
+          <w:rFonts w:ascii="Times New Roman" w:hAnsi="Times New Roman" w:cs="Times New Roman"/>
+        </w:rPr>
+        <w:t xml:space="preserve">/2 at every timestep, smearing the interface across an increasing number of cells over the five passes. Task 2 reduces the L1 error by 1.8× through CDI regularization, which actively counteracts the numerical diffusion and maintains the interface at the prescribed thickness ε = </w:t>
+      </w:r>
+      <w:proofErr w:type="spellStart"/>
+      <w:r>
+        <w:rPr>
+          <w:rFonts w:ascii="Times New Roman" w:hAnsi="Times New Roman" w:cs="Times New Roman"/>
+        </w:rPr>
+        <w:t>Δx</w:t>
+      </w:r>
+      <w:proofErr w:type="spellEnd"/>
+      <w:r>
+        <w:rPr>
+          <w:rFonts w:ascii="Times New Roman" w:hAnsi="Times New Roman" w:cs="Times New Roman"/>
+        </w:rPr>
+        <w:t>. The upgrade to second-order spatial and temporal discretization in Tasks 3 and 4 produces a further order-of-magnitude reduction in L1 error, demonstrating the combined benefit of higher-order advection and improved regularization.</w:t>
+      </w:r>
     </w:p>
     <w:p>
       <w:pPr>
@@ -5526,35 +5586,68 @@
         <w:rPr>
           <w:rFonts w:ascii="Times New Roman" w:hAnsi="Times New Roman" w:cs="Times New Roman"/>
         </w:rPr>
-        <w:t xml:space="preserve">The results confirm the expected progression from Task 1 through Task 4. Task 1 produces the largest error — the upwind scheme introduces numerical diffusion proportional to </w:t>
+        <w:t>Task 3 achieves L1 = 8.37×10⁻³, which is 38% lower than the paper's CDI value of 1.352×10⁻². This is expected rather than anomalous. The paper's CDI baseline uses first-order upwind advection, while Task 3 employs second-order central differencing with RK4 — a higher-order combination that reduces the advective truncation error and produces a more accurate solution at this grid resolution.</w:t>
+      </w:r>
+    </w:p>
+    <w:p>
+      <w:pPr>
+        <w:ind w:firstLine="720"/>
+        <w:rPr>
+          <w:rFonts w:ascii="Times New Roman" w:hAnsi="Times New Roman" w:cs="Times New Roman"/>
+        </w:rPr>
+      </w:pPr>
+      <w:r>
+        <w:rPr>
+          <w:rFonts w:ascii="Times New Roman" w:hAnsi="Times New Roman" w:cs="Times New Roman"/>
+        </w:rPr>
+        <w:t>Task 4 achieves L1 = 7.99×10⁻³, which is 1.38× larger than the paper's ACDI value of 5.76×10⁻³. At N = 50 the drop interface spans approximately four grid cells and the shear deformation is modest — both CDI and ACDI maintain a clean circular interface, leaving limited room for ACDI's improved normal computation to differentiate itself. The advantage of ACDI over CDI becomes substantially more pronounced in the shear flow test case, where severe interface deformation exposes the geometric limitations of the CDI normal.</w:t>
+      </w:r>
+    </w:p>
+    <w:p>
+      <w:pPr>
+        <w:ind w:firstLine="720"/>
+        <w:rPr>
+          <w:rFonts w:ascii="Times New Roman" w:hAnsi="Times New Roman" w:cs="Times New Roman"/>
+        </w:rPr>
+      </w:pPr>
+      <w:r>
+        <w:rPr>
+          <w:rFonts w:ascii="Times New Roman" w:hAnsi="Times New Roman" w:cs="Times New Roman"/>
+        </w:rPr>
+        <w:t xml:space="preserve"> All four tasks conserve mass to machine precision (|</w:t>
       </w:r>
       <w:proofErr w:type="spellStart"/>
       <w:r>
         <w:rPr>
           <w:rFonts w:ascii="Times New Roman" w:hAnsi="Times New Roman" w:cs="Times New Roman"/>
         </w:rPr>
-        <w:t>u·Δx</w:t>
+        <w:t>Δm</w:t>
       </w:r>
       <w:proofErr w:type="spellEnd"/>
       <w:r>
         <w:rPr>
           <w:rFonts w:ascii="Times New Roman" w:hAnsi="Times New Roman" w:cs="Times New Roman"/>
         </w:rPr>
-        <w:t xml:space="preserve">/2 at every timestep, smearing the interface across an increasing number of cells over the five passes. Task 2 reduces the L1 error by 1.8× through CDI regularization, which actively counteracts the numerical diffusion and maintains the interface at the prescribed thickness ε = </w:t>
-      </w:r>
-      <w:proofErr w:type="spellStart"/>
-      <w:r>
-        <w:rPr>
-          <w:rFonts w:ascii="Times New Roman" w:hAnsi="Times New Roman" w:cs="Times New Roman"/>
-        </w:rPr>
-        <w:t>Δx</w:t>
-      </w:r>
-      <w:proofErr w:type="spellEnd"/>
-      <w:r>
-        <w:rPr>
-          <w:rFonts w:ascii="Times New Roman" w:hAnsi="Times New Roman" w:cs="Times New Roman"/>
-        </w:rPr>
-        <w:t>. The upgrade to second-order spatial and temporal discretization in Tasks 3 and 4 produces a further order-of-magnitude reduction in L1 error, demonstrating the combined benefit of higher-order advection and improved regularization.</w:t>
+        <w:t xml:space="preserve">| &lt; 10⁻¹⁷) throughout the simulation. This follows from the conservative divergence-form discretization — the </w:t>
+      </w:r>
+      <w:r>
+        <w:rPr>
+          <w:rFonts w:ascii="Times New Roman" w:hAnsi="Times New Roman" w:cs="Times New Roman"/>
+        </w:rPr>
+        <w:lastRenderedPageBreak/>
+        <w:t xml:space="preserve">regularization terms are written as </w:t>
+      </w:r>
+      <w:r>
+        <w:rPr>
+          <w:rFonts w:ascii="Cambria Math" w:hAnsi="Cambria Math" w:cs="Cambria Math"/>
+        </w:rPr>
+        <w:t>∇</w:t>
+      </w:r>
+      <w:r>
+        <w:rPr>
+          <w:rFonts w:ascii="Times New Roman" w:hAnsi="Times New Roman" w:cs="Times New Roman"/>
+        </w:rPr>
+        <w:t>·A, which integrates to exactly zero over the periodic domain by the discrete divergence theorem. This result is consistent with the paper's statement that mass is conserved to machine precision in all simulations.</w:t>
       </w:r>
     </w:p>
     <w:p>
@@ -5568,75 +5661,6 @@
         <w:rPr>
           <w:rFonts w:ascii="Times New Roman" w:hAnsi="Times New Roman" w:cs="Times New Roman"/>
         </w:rPr>
-        <w:t>Task 3 achieves L1 = 8.37×10⁻³, which is 38% lower than the paper's CDI value of 1.352×10⁻². This is expected rather than anomalous. The paper's CDI baseline uses first-order upwind advection, while Task 3 employs second-order central differencing with RK4 — a higher-order combination that reduces the advective truncation error and produces a more accurate solution at this grid resolution.</w:t>
-      </w:r>
-    </w:p>
-    <w:p>
-      <w:pPr>
-        <w:ind w:firstLine="720"/>
-        <w:rPr>
-          <w:rFonts w:ascii="Times New Roman" w:hAnsi="Times New Roman" w:cs="Times New Roman"/>
-        </w:rPr>
-      </w:pPr>
-      <w:r>
-        <w:rPr>
-          <w:rFonts w:ascii="Times New Roman" w:hAnsi="Times New Roman" w:cs="Times New Roman"/>
-        </w:rPr>
-        <w:t>Task 4 achieves L1 = 7.99×10⁻³, which is 1.38× larger than the paper's ACDI value of 5.76×10⁻³. At N = 50 the drop interface spans approximately four grid cells and the shear deformation is modest — both CDI and ACDI maintain a clean circular interface, leaving limited room for ACDI's improved normal computation to differentiate itself. The advantage of ACDI over CDI becomes substantially more pronounced in the shear flow test case, where severe interface deformation exposes the geometric limitations of the CDI normal.</w:t>
-      </w:r>
-    </w:p>
-    <w:p>
-      <w:pPr>
-        <w:ind w:firstLine="720"/>
-        <w:rPr>
-          <w:rFonts w:ascii="Times New Roman" w:hAnsi="Times New Roman" w:cs="Times New Roman"/>
-        </w:rPr>
-      </w:pPr>
-      <w:r>
-        <w:rPr>
-          <w:rFonts w:ascii="Times New Roman" w:hAnsi="Times New Roman" w:cs="Times New Roman"/>
-        </w:rPr>
-        <w:lastRenderedPageBreak/>
-        <w:t xml:space="preserve"> All four tasks conserve mass to machine precision (|</w:t>
-      </w:r>
-      <w:proofErr w:type="spellStart"/>
-      <w:r>
-        <w:rPr>
-          <w:rFonts w:ascii="Times New Roman" w:hAnsi="Times New Roman" w:cs="Times New Roman"/>
-        </w:rPr>
-        <w:t>Δm</w:t>
-      </w:r>
-      <w:proofErr w:type="spellEnd"/>
-      <w:r>
-        <w:rPr>
-          <w:rFonts w:ascii="Times New Roman" w:hAnsi="Times New Roman" w:cs="Times New Roman"/>
-        </w:rPr>
-        <w:t xml:space="preserve">| &lt; 10⁻¹⁷) throughout the simulation. This follows from the conservative divergence-form discretization — the regularization terms are written as </w:t>
-      </w:r>
-      <w:r>
-        <w:rPr>
-          <w:rFonts w:ascii="Cambria Math" w:hAnsi="Cambria Math" w:cs="Cambria Math"/>
-        </w:rPr>
-        <w:t>∇</w:t>
-      </w:r>
-      <w:r>
-        <w:rPr>
-          <w:rFonts w:ascii="Times New Roman" w:hAnsi="Times New Roman" w:cs="Times New Roman"/>
-        </w:rPr>
-        <w:t>·A, which integrates to exactly zero over the periodic domain by the discrete divergence theorem. This result is consistent with the paper's statement that mass is conserved to machine precision in all simulations.</w:t>
-      </w:r>
-    </w:p>
-    <w:p>
-      <w:pPr>
-        <w:ind w:firstLine="720"/>
-        <w:rPr>
-          <w:rFonts w:ascii="Times New Roman" w:hAnsi="Times New Roman" w:cs="Times New Roman"/>
-        </w:rPr>
-      </w:pPr>
-      <w:r>
-        <w:rPr>
-          <w:rFonts w:ascii="Times New Roman" w:hAnsi="Times New Roman" w:cs="Times New Roman"/>
-        </w:rPr>
         <w:t xml:space="preserve"> Figure 1 shows the φ field at t = 1.0 for all four tasks. The progressive improvement in interface sharpness from Task 1 to Task 4 is visible — Task 1 produces a markedly diffuse interface with a visible trailing shadow behind the drop, while Tasks 3 and 4 maintain a clean, sharp boundary. Figure 2 overlays the φ = 0.5 iso-contour for all four tasks, showing that Tasks 3 and 4 recover a near-circular interface at t = 1.0, while Task 1 exhibits significant smearing and Task 2 shows residual shape distortion from the first-order advection scheme.</w:t>
       </w:r>
     </w:p>
@@ -5659,7 +5683,7 @@
           <w:noProof/>
         </w:rPr>
         <w:drawing>
-          <wp:anchor distT="0" distB="0" distL="114300" distR="114300" simplePos="0" relativeHeight="251658240" behindDoc="0" locked="0" layoutInCell="1" allowOverlap="1" wp14:anchorId="67E20E0F" wp14:editId="0232AD4E">
+          <wp:anchor distT="0" distB="0" distL="114300" distR="114300" simplePos="0" relativeHeight="251658240" behindDoc="0" locked="0" layoutInCell="1" allowOverlap="1" wp14:anchorId="67E20E0F" wp14:editId="03AA4655">
             <wp:simplePos x="0" y="0"/>
             <wp:positionH relativeFrom="column">
               <wp:posOffset>3081699</wp:posOffset>
@@ -5809,6 +5833,7 @@
       <w:r>
         <w:rPr>
           <w:rFonts w:ascii="Times New Roman" w:hAnsi="Times New Roman" w:cs="Times New Roman"/>
+          <w:noProof/>
         </w:rPr>
         <w:lastRenderedPageBreak/>
         <w:drawing>
@@ -11836,12 +11861,77 @@
           <w:rFonts w:ascii="Times New Roman" w:hAnsi="Times New Roman" w:cs="Times New Roman"/>
         </w:rPr>
         <w:tab/>
-      </w:r>
-      <w:r>
-        <w:rPr>
-          <w:rFonts w:ascii="Times New Roman" w:hAnsi="Times New Roman" w:cs="Times New Roman"/>
-        </w:rPr>
-        <w:t>The most significant extension identified in this work is the addition of a coupled momentum solver to enable fully hydrodynamic simulations. The present implementation solves the phase-field equation in isolation with a prescribed velocity — a kinematic test that demonstrates interface tracking accuracy but does not capture the two-way coupling between the interface and the flow field that characterizes real two-phase flows. Adding a pressure solver and the consistent momentum transport equation derived in Jain (2022) Section 4 would enable simulation of physically driven flows including Rayleigh-Taylor instability, droplet coalescence, and the droplet-laden isotropic turbulence case presented in Section 6.3 of the paper, where ACDI's consistent momentum formulation provides essential stability at high density ratios.</w:t>
+        <w:t>As a direct application of the ACDI framework developed in this work, a 2D droplet impact simulation was implemented, coupling the ACDI phase-field solver to a full incompressible Navier-Stokes solver. A liquid drop (Re = 500, We = 100) falling under gravity onto a quiescent liquid pool was selected as the test case, providing a scenario that exercises the NS–ACDI coupling under a large-density-ratio (ρ₁/ρ₂ = 100) and surface-tension-driven interface dynamics. The solver uses the fractional-step projection method with CSF surface tension and a buoyancy body force. This section describes the principal numerical challenges encountered during development and the open issues that remain.</w:t>
+      </w:r>
+    </w:p>
+    <w:p>
+      <w:pPr>
+        <w:rPr>
+          <w:rFonts w:ascii="Times New Roman" w:hAnsi="Times New Roman" w:cs="Times New Roman"/>
+        </w:rPr>
+      </w:pPr>
+      <w:r>
+        <w:rPr>
+          <w:rFonts w:ascii="Times New Roman" w:hAnsi="Times New Roman" w:cs="Times New Roman"/>
+        </w:rPr>
+        <w:tab/>
+        <w:t xml:space="preserve">The first challenge was a boundary condition inconsistency in the pressure Poisson solver. The doubly-periodic domain caused the drop’s pressure field to couple through the top and bottom boundaries, producing a spurious pressure contribution at the pool surface. This was </w:t>
+      </w:r>
+      <w:r>
+        <w:rPr>
+          <w:rFonts w:ascii="Times New Roman" w:hAnsi="Times New Roman" w:cs="Times New Roman"/>
+        </w:rPr>
+        <w:lastRenderedPageBreak/>
+        <w:t>corrected by imposing Neumann conditions (∂p/∂y = 0) at the horizontal walls via the even-extension method: the divergence field ∇·u∗ is reflected evenly onto a 2N extended domain, the FFT Poisson solve is performed there, and the first N rows are retained. A secondary inconsistency was found in the cell-centre-to-face interpolation: periodic y-averaging for the normal face velocity produced a post-projection divergence residual of 4.6. Correcting to wall boundary conditions (v = 0 at top and bottom faces) removed this artefact. A further subtlety arose from the use of continuous wavenumber eigenvalues (k²) rather than the exact discrete eigenvalues of the compact finite-difference Laplacian. The continuous approximation introduced a mismatch between the FFT solve and the gradient correction step that persisted regardless of boundary condition choice. Replacing k² with the exact discrete eigenvalues λ = (2 sin(πm/N)/h)² and applying a compact face-based gradient correction reduced the post-projection divergence to machine precision (≤ 10⁻¹³).</w:t>
+      </w:r>
+    </w:p>
+    <w:p>
+      <w:pPr>
+        <w:rPr>
+          <w:rFonts w:ascii="Times New Roman" w:hAnsi="Times New Roman" w:cs="Times New Roman"/>
+        </w:rPr>
+      </w:pPr>
+      <w:r>
+        <w:rPr>
+          <w:rFonts w:ascii="Times New Roman" w:hAnsi="Times New Roman" w:cs="Times New Roman"/>
+        </w:rPr>
+        <w:tab/>
+        <w:t>With the projection step corrected, a second unphysical result was observed: the drop did not fall. The buoyancy body force is formulated as g_body = −(ρ − ρ_init)/ρ·g, where ρ_init is the initial density field. When ρ_init was computed from the full initial φ including the drop, ρ_init = ρ₁ at the drop location, giving g_body = 0. Correcting ρ_init to the pool-only initial condition (no drop) gave the physically correct result: g_body ≈ −g in the drop and g_body = 0 in the pool. A subsequent issue was that even with the correct body force the drop decelerated rather than accelerating. The cause was the use of the global mean density ρ̅ in the pressure correction u = u∗ − (Δt/ρ̅)∇p: with ρ̅ ≈ 0.33 and ρ₁ = 1.0, the correction was approximately 3× too large for the liquid phase, creating a spurious deceleration of ≈3 m/s² per step against a buoyancy acceleration of 0.5 m/s². This was resolved by implementing a variable-density preconditioned conjugate gradient (PCG) Poisson solver that solves ∇·((Δt/ρ)∇p) = ∇·u∗ exactly, using the constant-coefficient FFT solver as a preconditioner. With condition number κ ≈ ρ₁/ρ₂ = 100, the PCG converges in √κ ≈10 iterations and eliminates the overcorrection artefact.</w:t>
+      </w:r>
+    </w:p>
+    <w:p>
+      <w:pPr>
+        <w:rPr>
+          <w:rFonts w:ascii="Times New Roman" w:hAnsi="Times New Roman" w:cs="Times New Roman"/>
+        </w:rPr>
+      </w:pPr>
+      <w:r>
+        <w:rPr>
+          <w:rFonts w:ascii="Times New Roman" w:hAnsi="Times New Roman" w:cs="Times New Roman"/>
+        </w:rPr>
+        <w:tab/>
+        <w:t>The final instability manifested as a solver crash at t ≈ 2.4, after impact when a crown was forming. Gas-phase cell velocities grew unboundedly and the simulation diverged to NaN within a few steps. The source was the pressure correction factor Δt/ρ_face in the gas phase: with ρ_face ≈ ρ₂ = 0.01 the factor is 100× larger than in the liquid, and any residual PCG error in the gas-phase pressure gradient produced velocities of order 10–100 per step. This was resolved by flooring the face density at ρ̅ when applying the correction: ρ_face = max(ρ_face, ρ̅). In pure-gas regions the PCG pressure is approximately harmonic (∇²p ≈ 0), so substituting ρ̅ for ρ₂ introduces negligible error in the divergence. With this floor in place the simulation runs stably to t = 3.0 at 64×64.</w:t>
+      </w:r>
+    </w:p>
+    <w:p>
+      <w:pPr>
+        <w:rPr>
+          <w:rFonts w:ascii="Times New Roman" w:hAnsi="Times New Roman" w:cs="Times New Roman"/>
+        </w:rPr>
+      </w:pPr>
+      <w:r>
+        <w:rPr>
+          <w:rFonts w:ascii="Times New Roman" w:hAnsi="Times New Roman" w:cs="Times New Roman"/>
+        </w:rPr>
+        <w:tab/>
+        <w:t xml:space="preserve">The current implementation produces qualitatively correct physics: the drop accelerates under buoyancy, impacts the pool, and generates a visible crown splash, with global mass conservation error below 0.5% at t = 3.0. Several open issues remain. Post-impact crown topology, including pinch-off and satellite drop formation, is strongly resolution-sensitive. At 64×64 with ε = Δx the diffuse interface spans approximately four cells; crown structures </w:t>
+      </w:r>
+      <w:r>
+        <w:rPr>
+          <w:rFonts w:ascii="Times New Roman" w:hAnsi="Times New Roman" w:cs="Times New Roman"/>
+        </w:rPr>
+        <w:lastRenderedPageBreak/>
+        <w:t>narrower than four cells register as topological breaks before the fluid physically separates, an inherent limitation of uniform-grid diffuse interface methods that would require a 256×256 or finer uniform grid to mitigate. Additionally, the CDI Task 2 solver has a known overflow issue in which φ exits [0, 1] under large regularization increments, producing NaN errors; this remains unresolved and is noted as a priority for correction.</w:t>
       </w:r>
     </w:p>
     <w:p>
@@ -11865,16 +11955,7 @@
           <w:i/>
           <w:iCs/>
         </w:rPr>
-        <w:lastRenderedPageBreak/>
-        <w:t xml:space="preserve">8.6 </w:t>
-      </w:r>
-      <w:r>
-        <w:rPr>
-          <w:rFonts w:ascii="Times New Roman" w:hAnsi="Times New Roman" w:cs="Times New Roman"/>
-          <w:i/>
-          <w:iCs/>
-        </w:rPr>
-        <w:t>Data and Code Availability</w:t>
+        <w:t>8.6 Data and Code Availability</w:t>
       </w:r>
       <w:r>
         <w:rPr>
@@ -12522,6 +12603,7 @@
   <w:style w:type="character" w:default="1" w:styleId="DefaultParagraphFont">
     <w:name w:val="Default Paragraph Font"/>
     <w:uiPriority w:val="1"/>
+    <w:semiHidden/>
     <w:unhideWhenUsed/>
   </w:style>
   <w:style w:type="table" w:default="1" w:styleId="TableNormal">

</xml_diff>